<commit_message>
Auto-save: 14 file(s) — 2026-10-27 10:19
</commit_message>
<xml_diff>
--- a/Notes/2026-10-16-xloop-applied-ai-solutions-hub-page-content-v1.docx
+++ b/Notes/2026-10-16-xloop-applied-ai-solutions-hub-page-content-v1.docx
@@ -620,7 +620,7 @@
                 <w:sz w:val="19"/>
                 <w:szCs w:val="19"/>
               </w:rPr>
-              <w:t xml:space="preserve">Service (with the six children as </w:t>
+              <w:t xml:space="preserve">Service, with the six capabilities as </w:t>
             </w:r>
             <w:r>
               <w:rPr>
@@ -629,6 +629,24 @@
                 <w:sz w:val="19"/>
                 <w:szCs w:val="19"/>
               </w:rPr>
+              <w:t xml:space="preserve">Service</w:t>
+            </w:r>
+            <w:r>
+              <w:rPr>
+                <w:rFonts w:ascii="Arial" w:cs="Arial" w:eastAsia="Arial" w:hAnsi="Arial"/>
+                <w:color w:val="1A1A1A"/>
+                <w:sz w:val="19"/>
+                <w:szCs w:val="19"/>
+              </w:rPr>
+              <w:t xml:space="preserve"> entities in </w:t>
+            </w:r>
+            <w:r>
+              <w:rPr>
+                <w:rFonts w:ascii="Consolas" w:cs="Consolas" w:eastAsia="Consolas" w:hAnsi="Consolas"/>
+                <w:color w:val="1A1A1A"/>
+                <w:sz w:val="19"/>
+                <w:szCs w:val="19"/>
+              </w:rPr>
               <w:t xml:space="preserve">hasOfferCatalog</w:t>
             </w:r>
             <w:r>
@@ -638,7 +656,7 @@
                 <w:sz w:val="19"/>
                 <w:szCs w:val="19"/>
               </w:rPr>
-              <w:t xml:space="preserve">) · FAQPage · BreadcrumbList · Organization</w:t>
+              <w:t xml:space="preserve"> · FAQPage · BreadcrumbList · Organization</w:t>
             </w:r>
           </w:p>
         </w:tc>
@@ -875,7 +893,7 @@
           <w:sz w:val="21"/>
           <w:szCs w:val="21"/>
         </w:rPr>
-        <w:t xml:space="preserve"> Bring one use case. Our AI engineers will tell you if it can work, what data it needs and how we would build it.</w:t>
+        <w:t xml:space="preserve"> Bring one use case. Our AI engineers will tell you if it can work, what data it needs, how we would build it, and give you a straight answer in 30 minutes.</w:t>
       </w:r>
     </w:p>
     <w:p>
@@ -995,7 +1013,7 @@
           <w:sz w:val="21"/>
           <w:szCs w:val="21"/>
         </w:rPr>
-        <w:t xml:space="preserve">Applied AI solutions are AI systems built to do a specific job inside a business: answer customer questions, read documents, inspect images, forecast demand or run a workflow. Unlike a research model or a demo, they connect to your data and systems, run under monitoring, and have an owner after go live.</w:t>
+        <w:t xml:space="preserve">Applied AI solutions are AI systems built to do a specific job inside a business: answer customer questions, read documents, inspect images, forecast demand or run a workflow. Unlike a research model or a demo, they connect to your data and systems, run under monitoring, and have an owner after go live. xLoop builds applied AI on your data and runs it with guardrails, human approval and monitoring.</w:t>
       </w:r>
     </w:p>
     <w:p>
@@ -1055,6 +1073,20 @@
           <w:szCs w:val="21"/>
         </w:rPr>
         <w:t xml:space="preserve"> Our Applied AI Capabilities</w:t>
+      </w:r>
+    </w:p>
+    <w:p>
+      <w:pPr>
+        <w:spacing w:after="130" w:line="300"/>
+      </w:pPr>
+      <w:r>
+        <w:rPr>
+          <w:rFonts w:ascii="Arial" w:cs="Arial" w:eastAsia="Arial" w:hAnsi="Arial"/>
+          <w:color w:val="1A1A1A"/>
+          <w:sz w:val="21"/>
+          <w:szCs w:val="21"/>
+        </w:rPr>
+        <w:t xml:space="preserve">xLoop builds six kinds of applied AI: generative AI, large language models, AI agents, computer vision, predictive analytics and machine learning. Each runs in production on your data, with guardrails and monitoring.</w:t>
       </w:r>
     </w:p>
     <w:p>
@@ -2120,7 +2152,7 @@
           <w:sz w:val="21"/>
           <w:szCs w:val="21"/>
         </w:rPr>
-        <w:t xml:space="preserve">Start from the job, not the technology.</w:t>
+        <w:t xml:space="preserve">The right AI capability depends on the job: language models for documents and questions, agents for processes, computer vision for images and video, and predictive models for forecasts. Start from the job, not the technology.</w:t>
       </w:r>
     </w:p>
     <w:tbl>
@@ -2658,7 +2690,7 @@
           <w:sz w:val="21"/>
           <w:szCs w:val="21"/>
         </w:rPr>
-        <w:t xml:space="preserve">Most pilots stall between the demo and the business. These are the things we build in from the start, so yours doesn't.</w:t>
+        <w:t xml:space="preserve">Production ready AI is grounded in your data, guarded on input and output, approved by people where it matters, monitored, security tested and running in your environment. Most pilots stall because one of these is missing, so xLoop builds all six in from the start.</w:t>
       </w:r>
     </w:p>
     <w:p>
@@ -3346,6 +3378,20 @@
           <w:szCs w:val="21"/>
         </w:rPr>
         <w:t xml:space="preserve"> How an Applied AI Project Works</w:t>
+      </w:r>
+    </w:p>
+    <w:p>
+      <w:pPr>
+        <w:spacing w:after="130" w:line="300"/>
+      </w:pPr>
+      <w:r>
+        <w:rPr>
+          <w:rFonts w:ascii="Arial" w:cs="Arial" w:eastAsia="Arial" w:hAnsi="Arial"/>
+          <w:color w:val="1A1A1A"/>
+          <w:sz w:val="21"/>
+          <w:szCs w:val="21"/>
+        </w:rPr>
+        <w:t xml:space="preserve">An applied AI project with xLoop runs in four steps: a 30 minute use case review, discovery and design, a production pilot in six to twelve weeks, then a phased rollout.</w:t>
       </w:r>
     </w:p>
     <w:p>
@@ -3899,6 +3945,20 @@
           <w:szCs w:val="21"/>
         </w:rPr>
         <w:t xml:space="preserve"> AI Solutions We've Delivered</w:t>
+      </w:r>
+    </w:p>
+    <w:p>
+      <w:pPr>
+        <w:spacing w:after="130" w:line="300"/>
+      </w:pPr>
+      <w:r>
+        <w:rPr>
+          <w:rFonts w:ascii="Arial" w:cs="Arial" w:eastAsia="Arial" w:hAnsi="Arial"/>
+          <w:color w:val="1A1A1A"/>
+          <w:sz w:val="21"/>
+          <w:szCs w:val="21"/>
+        </w:rPr>
+        <w:t xml:space="preserve">xLoop has AI in production for a bank with 1,200 branches, a leading Saudi Arabian fast food chain, a Canadian healthcare platform and a leading asset manager in Pakistan. Clients are anonymous; every detail is from delivered work.</w:t>
       </w:r>
     </w:p>
     <w:p>
@@ -5705,16 +5765,16 @@
           <w:sz w:val="21"/>
           <w:szCs w:val="21"/>
         </w:rPr>
-        <w:t xml:space="preserve">CTA:</w:t>
-      </w:r>
-      <w:r>
-        <w:rPr>
-          <w:rFonts w:ascii="Arial" w:cs="Arial" w:eastAsia="Arial" w:hAnsi="Arial"/>
-          <w:color w:val="1A1A1A"/>
-          <w:sz w:val="21"/>
-          <w:szCs w:val="21"/>
-        </w:rPr>
-        <w:t xml:space="preserve"> Book a 30 Minute AI Use Case Review →</w:t>
+        <w:t xml:space="preserve">Proof line (above the button):</w:t>
+      </w:r>
+      <w:r>
+        <w:rPr>
+          <w:rFonts w:ascii="Arial" w:cs="Arial" w:eastAsia="Arial" w:hAnsi="Arial"/>
+          <w:color w:val="1A1A1A"/>
+          <w:sz w:val="21"/>
+          <w:szCs w:val="21"/>
+        </w:rPr>
+        <w:t xml:space="preserve"> AI in production for a bank with 1,200 branches, a Gulf fast food chain and one of Pakistan's largest asset managers.</w:t>
       </w:r>
     </w:p>
     <w:p>
@@ -5730,6 +5790,31 @@
           <w:sz w:val="21"/>
           <w:szCs w:val="21"/>
         </w:rPr>
+        <w:t xml:space="preserve">CTA:</w:t>
+      </w:r>
+      <w:r>
+        <w:rPr>
+          <w:rFonts w:ascii="Arial" w:cs="Arial" w:eastAsia="Arial" w:hAnsi="Arial"/>
+          <w:color w:val="1A1A1A"/>
+          <w:sz w:val="21"/>
+          <w:szCs w:val="21"/>
+        </w:rPr>
+        <w:t xml:space="preserve"> Book a 30 Minute AI Use Case Review →</w:t>
+      </w:r>
+    </w:p>
+    <w:p>
+      <w:pPr>
+        <w:spacing w:after="130" w:line="300"/>
+      </w:pPr>
+      <w:r>
+        <w:rPr>
+          <w:rFonts w:ascii="Arial" w:cs="Arial" w:eastAsia="Arial" w:hAnsi="Arial"/>
+          <w:b/>
+          <w:bCs/>
+          <w:color w:val="1A1A1A"/>
+          <w:sz w:val="21"/>
+          <w:szCs w:val="21"/>
+        </w:rPr>
         <w:t xml:space="preserve">Form fields:</w:t>
       </w:r>
       <w:r>
@@ -5739,7 +5824,23 @@
           <w:sz w:val="21"/>
           <w:szCs w:val="21"/>
         </w:rPr>
-        <w:t xml:space="preserve"> Name · Work email · Company · Role · Capability (Generative AI · LLMs · AI agents · Computer vision · Predictive analytics · Machine learning · Not sure) · Describe the use case in one line</w:t>
+        <w:t xml:space="preserve"> Name · Work email · Company · Describe the use case in one line</w:t>
+      </w:r>
+    </w:p>
+    <w:p>
+      <w:pPr>
+        <w:spacing w:after="120"/>
+      </w:pPr>
+      <w:r>
+        <w:rPr>
+          <w:rFonts w:ascii="Arial" w:cs="Arial" w:eastAsia="Arial" w:hAnsi="Arial"/>
+          <w:i/>
+          <w:iCs/>
+          <w:color w:val="6B7280"/>
+          <w:sz w:val="18"/>
+          <w:szCs w:val="18"/>
+        </w:rPr>
+        <w:t xml:space="preserve">Four fields only (27 Oct review). Role and size are asked on the call.</w:t>
       </w:r>
     </w:p>
     <w:p>
@@ -5771,7 +5872,7 @@
           <w:sz w:val="21"/>
           <w:szCs w:val="21"/>
         </w:rPr>
-        <w:t xml:space="preserve">Data &amp; AI Consulting · Data Analytics &amp; Engineering · AI Security · Corporate AI Training</w:t>
+        <w:t xml:space="preserve">Data and AI consulting and strategy (/ai-consultancy) · Data platforms and engineering (/services/data-analytics) · AI security testing and red teaming (/services/ai-security-service) · Corporate AI training for teams (/xcelerate/corporate-ai-training)</w:t>
       </w:r>
     </w:p>
     <w:p>

</xml_diff>